<commit_message>
Enhance evaluation scripts and frontend with clarification handling and improved ambiguity scoring
</commit_message>
<xml_diff>
--- a/Results.docx
+++ b/Results.docx
@@ -23,7 +23,15 @@
     </w:p>
     <w:p>
       <w:r>
-        <w:t>All experiments were conducted on a custom decision dataset of 56 questions spanning five categories (factual, unanswerable, ambiguous, multi-hop, hallucination-prone), evaluated across five systems sharing the same LLM backbone (Llama 3 8B via Ollama).</w:t>
+        <w:t xml:space="preserve">All experiments were conducted on a custom decision dataset of 56 questions spanning five categories (factual, unanswerable, ambiguous, multi-hop, hallucination-prone), evaluated across five systems sharing the same LLM backbone (Llama 3 8B via </w:t>
+      </w:r>
+      <w:proofErr w:type="spellStart"/>
+      <w:r>
+        <w:t>Ollama</w:t>
+      </w:r>
+      <w:proofErr w:type="spellEnd"/>
+      <w:r>
+        <w:t>).</w:t>
       </w:r>
     </w:p>
     <w:p>
@@ -1372,7 +1380,15 @@
         <w:t>only system that attempts all five action types</w:t>
       </w:r>
       <w:r>
-        <w:t>, achieving non-zero recall on Answer, Retrieve, Verify, Clarify, and Abstain. Its unnecessary retrieval rate of 5.5% is </w:t>
+        <w:t xml:space="preserve">, achieving non-zero recall on Answer, Retrieve, Verify, Clarify, and Abstain. </w:t>
+      </w:r>
+      <w:proofErr w:type="spellStart"/>
+      <w:r>
+        <w:t>Its</w:t>
+      </w:r>
+      <w:proofErr w:type="spellEnd"/>
+      <w:r>
+        <w:t xml:space="preserve"> unnecessary retrieval rate of 5.5% is </w:t>
       </w:r>
       <w:r>
         <w:rPr>
@@ -1949,56 +1965,83 @@
                 <w:bCs/>
               </w:rPr>
             </w:pPr>
-            <w:r>
-              <w:rPr>
-                <w:b/>
-                <w:bCs/>
-              </w:rPr>
-              <w:t>Avg LLM Calls ↓</w:t>
-            </w:r>
-          </w:p>
-        </w:tc>
-        <w:tc>
-          <w:tcPr>
-            <w:tcW w:w="0" w:type="auto"/>
-            <w:hideMark/>
-          </w:tcPr>
-          <w:p>
-            <w:pPr>
-              <w:spacing w:after="160" w:line="259" w:lineRule="auto"/>
-              <w:rPr>
-                <w:b/>
-                <w:bCs/>
-              </w:rPr>
-            </w:pPr>
-            <w:r>
-              <w:rPr>
-                <w:b/>
-                <w:bCs/>
-              </w:rPr>
-              <w:t>Avg Retrieval Calls ↓</w:t>
-            </w:r>
-          </w:p>
-        </w:tc>
-        <w:tc>
-          <w:tcPr>
-            <w:tcW w:w="0" w:type="auto"/>
-            <w:hideMark/>
-          </w:tcPr>
-          <w:p>
-            <w:pPr>
-              <w:spacing w:after="160" w:line="259" w:lineRule="auto"/>
-              <w:rPr>
-                <w:b/>
-                <w:bCs/>
-              </w:rPr>
-            </w:pPr>
-            <w:r>
-              <w:rPr>
-                <w:b/>
-                <w:bCs/>
-              </w:rPr>
-              <w:t>Avg Latency ↓</w:t>
+            <w:proofErr w:type="spellStart"/>
+            <w:r>
+              <w:rPr>
+                <w:b/>
+                <w:bCs/>
+              </w:rPr>
+              <w:t>Avg</w:t>
+            </w:r>
+            <w:proofErr w:type="spellEnd"/>
+            <w:r>
+              <w:rPr>
+                <w:b/>
+                <w:bCs/>
+              </w:rPr>
+              <w:t xml:space="preserve"> LLM Calls ↓</w:t>
+            </w:r>
+          </w:p>
+        </w:tc>
+        <w:tc>
+          <w:tcPr>
+            <w:tcW w:w="0" w:type="auto"/>
+            <w:hideMark/>
+          </w:tcPr>
+          <w:p>
+            <w:pPr>
+              <w:spacing w:after="160" w:line="259" w:lineRule="auto"/>
+              <w:rPr>
+                <w:b/>
+                <w:bCs/>
+              </w:rPr>
+            </w:pPr>
+            <w:proofErr w:type="spellStart"/>
+            <w:r>
+              <w:rPr>
+                <w:b/>
+                <w:bCs/>
+              </w:rPr>
+              <w:t>Avg</w:t>
+            </w:r>
+            <w:proofErr w:type="spellEnd"/>
+            <w:r>
+              <w:rPr>
+                <w:b/>
+                <w:bCs/>
+              </w:rPr>
+              <w:t xml:space="preserve"> Retrieval Calls ↓</w:t>
+            </w:r>
+          </w:p>
+        </w:tc>
+        <w:tc>
+          <w:tcPr>
+            <w:tcW w:w="0" w:type="auto"/>
+            <w:hideMark/>
+          </w:tcPr>
+          <w:p>
+            <w:pPr>
+              <w:spacing w:after="160" w:line="259" w:lineRule="auto"/>
+              <w:rPr>
+                <w:b/>
+                <w:bCs/>
+              </w:rPr>
+            </w:pPr>
+            <w:proofErr w:type="spellStart"/>
+            <w:r>
+              <w:rPr>
+                <w:b/>
+                <w:bCs/>
+              </w:rPr>
+              <w:t>Avg</w:t>
+            </w:r>
+            <w:proofErr w:type="spellEnd"/>
+            <w:r>
+              <w:rPr>
+                <w:b/>
+                <w:bCs/>
+              </w:rPr>
+              <w:t xml:space="preserve"> Latency ↓</w:t>
             </w:r>
           </w:p>
         </w:tc>
@@ -2332,7 +2375,15 @@
     </w:tbl>
     <w:p>
       <w:r>
-        <w:t>The adaptive agent uses more LLM calls than simpler baselines due to self-consistency sampling (multiple generations for uncertainty estimation). Fixed-Threshold uses even more (8.21) because it applies the same sampling regardless of question difficulty. The adaptive agent's selective retrieval (1.31 avg calls vs 1.00 for Standard RAG) reflects targeted evidence-fetching only when uncertainty warrants it.</w:t>
+        <w:t xml:space="preserve">The adaptive agent uses more LLM calls than simpler baselines due to self-consistency sampling (multiple generations for uncertainty estimation). Fixed-Threshold uses even more (8.21) because it applies the same sampling regardless of question difficulty. The adaptive agent's selective retrieval (1.31 </w:t>
+      </w:r>
+      <w:proofErr w:type="spellStart"/>
+      <w:r>
+        <w:t>avg</w:t>
+      </w:r>
+      <w:proofErr w:type="spellEnd"/>
+      <w:r>
+        <w:t xml:space="preserve"> calls vs 1.00 for Standard RAG) reflects targeted evidence-fetching only when uncertainty warrants it.</w:t>
       </w:r>
     </w:p>
     <w:p>
@@ -3363,7 +3414,15 @@
     </w:tbl>
     <w:p>
       <w:r>
-        <w:t>The sweep confirms a clear reliability–cost tradeoff. Accuracy peaks at threshold=0.1–0.3 and degrades monotonically as the threshold rises and retrieval is suppressed. At threshold≥0.7 the agent never retrieves, collapsing to Normal LLM behaviour (21.4% accuracy). The optimal operating point is </w:t>
+        <w:t xml:space="preserve">The sweep confirms a clear reliability–cost </w:t>
+      </w:r>
+      <w:proofErr w:type="spellStart"/>
+      <w:r>
+        <w:t>tradeoff</w:t>
+      </w:r>
+      <w:proofErr w:type="spellEnd"/>
+      <w:r>
+        <w:t>. Accuracy peaks at threshold=0.1–0.3 and degrades monotonically as the threshold rises and retrieval is suppressed. At threshold≥0.7 the agent never retrieves, collapsing to Normal LLM behaviour (21.4% accuracy). The optimal operating point is </w:t>
       </w:r>
       <w:r>
         <w:rPr>
@@ -3379,6 +3438,9 @@
     <w:p/>
     <w:p>
       <w:r>
+        <w:rPr>
+          <w:noProof/>
+        </w:rPr>
         <w:drawing>
           <wp:inline distT="0" distB="0" distL="0" distR="0" wp14:anchorId="3BA2D6F7" wp14:editId="0DC7C9CD">
             <wp:extent cx="5731510" cy="3582035"/>
@@ -3852,7 +3914,39 @@
         <w:t>λ=0.05 as the optimal cost-penalty</w:t>
       </w:r>
       <w:r>
-        <w:t>, consistent with the formal objective $A^* = \arg\max_A [R(A) - \lambda \cdot C(A)]$.</w:t>
+        <w:t>, consistent with the formal objective $A^* = \</w:t>
+      </w:r>
+      <w:proofErr w:type="spellStart"/>
+      <w:r>
+        <w:t>arg</w:t>
+      </w:r>
+      <w:proofErr w:type="spellEnd"/>
+      <w:r>
+        <w:t>\</w:t>
+      </w:r>
+      <w:proofErr w:type="spellStart"/>
+      <w:r>
+        <w:t>max_A</w:t>
+      </w:r>
+      <w:proofErr w:type="spellEnd"/>
+      <w:r>
+        <w:t xml:space="preserve"> [R(A) - \lambda \</w:t>
+      </w:r>
+      <w:proofErr w:type="spellStart"/>
+      <w:r>
+        <w:t>cdot</w:t>
+      </w:r>
+      <w:proofErr w:type="spellEnd"/>
+      <w:r>
+        <w:t xml:space="preserve"> C(A</w:t>
+      </w:r>
+      <w:proofErr w:type="gramStart"/>
+      <w:r>
+        <w:t>)]$</w:t>
+      </w:r>
+      <w:proofErr w:type="gramEnd"/>
+      <w:r>
+        <w:t>.</w:t>
       </w:r>
     </w:p>
     <w:p/>
@@ -3978,7 +4072,7 @@
     <w:p>
       <w:r>
         <w:pict w14:anchorId="73A5F4F1">
-          <v:rect id="_x0000_i1045" style="width:273.3pt;height:.75pt" o:hrpct="0" o:hralign="center" o:hrstd="t" o:hr="t" fillcolor="#a0a0a0" stroked="f"/>
+          <v:rect id="_x0000_i1033" style="width:273.3pt;height:.75pt" o:hrpct="0" o:hralign="center" o:hrstd="t" o:hr="t" fillcolor="#a0a0a0" stroked="f"/>
         </w:pict>
       </w:r>
     </w:p>
@@ -4091,7 +4185,7 @@
     <w:p>
       <w:r>
         <w:pict w14:anchorId="40B2BC0F">
-          <v:rect id="_x0000_i1046" style="width:273.3pt;height:.75pt" o:hrpct="0" o:hralign="center" o:hrstd="t" o:hr="t" fillcolor="#a0a0a0" stroked="f"/>
+          <v:rect id="_x0000_i1034" style="width:273.3pt;height:.75pt" o:hrpct="0" o:hralign="center" o:hrstd="t" o:hr="t" fillcolor="#a0a0a0" stroked="f"/>
         </w:pict>
       </w:r>
     </w:p>
@@ -4109,6 +4203,1537 @@
       <w:r>
         <w:t>The adaptive agent achieves the lowest hallucination rate (38.9%) and best uncertainty calibration (AUROC=0.777, ECE=0.176) across all five systems, while reducing unnecessary retrieval by 7.8× compared to Standard RAG, demonstrating that selective action selection improves reliability without proportional cost increase — though results on a 56-question dataset should be considered preliminary.</w:t>
       </w:r>
+    </w:p>
+    <w:p/>
+    <w:p/>
+    <w:p/>
+    <w:p/>
+    <w:p>
+      <w:pPr>
+        <w:rPr>
+          <w:b/>
+          <w:bCs/>
+        </w:rPr>
+      </w:pPr>
+      <w:proofErr w:type="spellStart"/>
+      <w:r>
+        <w:t>Vrify</w:t>
+      </w:r>
+      <w:proofErr w:type="spellEnd"/>
+      <w:r>
+        <w:t xml:space="preserve"> </w:t>
+      </w:r>
+      <w:r>
+        <w:t>"Who directed The Prestige — is it the same director as Inception?"</w:t>
+      </w:r>
+      <w:r>
+        <w:br/>
+      </w:r>
+      <w:r>
+        <w:br/>
+      </w:r>
+      <w:r>
+        <w:br/>
+      </w:r>
+      <w:r>
+        <w:br/>
+      </w:r>
+      <w:r>
+        <w:rPr>
+          <w:b/>
+          <w:bCs/>
+        </w:rPr>
+        <w:t>Project Overview</w:t>
+      </w:r>
+    </w:p>
+    <w:p>
+      <w:pPr>
+        <w:rPr>
+          <w:b/>
+          <w:bCs/>
+        </w:rPr>
+      </w:pPr>
+      <w:r>
+        <w:rPr>
+          <w:b/>
+          <w:bCs/>
+        </w:rPr>
+        <w:t>What It Does</w:t>
+      </w:r>
+    </w:p>
+    <w:p>
+      <w:r>
+        <w:t>An autonomous LLM agent that decides </w:t>
+      </w:r>
+      <w:r>
+        <w:rPr>
+          <w:i/>
+          <w:iCs/>
+        </w:rPr>
+        <w:t>how</w:t>
+      </w:r>
+      <w:r>
+        <w:t> to answer a question — not just what to answer. Instead of always retrieving or always answering directly, it estimates uncertainty and evidence quality at inference time and picks the optimal action.</w:t>
+      </w:r>
+    </w:p>
+    <w:p>
+      <w:r>
+        <w:pict w14:anchorId="61EEC2F4">
+          <v:rect id="_x0000_i1077" style="width:219.3pt;height:.75pt" o:hrpct="0" o:hralign="center" o:hrstd="t" o:hr="t" fillcolor="#a0a0a0" stroked="f"/>
+        </w:pict>
+      </w:r>
+    </w:p>
+    <w:p>
+      <w:pPr>
+        <w:rPr>
+          <w:b/>
+          <w:bCs/>
+        </w:rPr>
+      </w:pPr>
+      <w:r>
+        <w:rPr>
+          <w:b/>
+          <w:bCs/>
+        </w:rPr>
+        <w:t>Core Flow (</w:t>
+      </w:r>
+      <w:proofErr w:type="spellStart"/>
+      <w:r>
+        <w:rPr>
+          <w:b/>
+          <w:bCs/>
+        </w:rPr>
+        <w:t>LangGraph</w:t>
+      </w:r>
+      <w:proofErr w:type="spellEnd"/>
+      <w:r>
+        <w:rPr>
+          <w:b/>
+          <w:bCs/>
+        </w:rPr>
+        <w:t>)</w:t>
+      </w:r>
+    </w:p>
+    <w:p>
+      <w:r>
+        <w:t xml:space="preserve">Query → </w:t>
+      </w:r>
+      <w:proofErr w:type="spellStart"/>
+      <w:r>
+        <w:t>extract_features</w:t>
+      </w:r>
+      <w:proofErr w:type="spellEnd"/>
+      <w:r>
+        <w:t xml:space="preserve"> → decide → [answer | retrieve | clarify | abstain | verify]</w:t>
+      </w:r>
+    </w:p>
+    <w:p>
+      <w:r>
+        <w:t xml:space="preserve">                                          ↓</w:t>
+      </w:r>
+    </w:p>
+    <w:p>
+      <w:r>
+        <w:t xml:space="preserve">                                   retrieve → </w:t>
+      </w:r>
+      <w:proofErr w:type="spellStart"/>
+      <w:r>
+        <w:t>post_retrieve_decide</w:t>
+      </w:r>
+      <w:proofErr w:type="spellEnd"/>
+      <w:r>
+        <w:t xml:space="preserve"> → [</w:t>
+      </w:r>
+      <w:proofErr w:type="spellStart"/>
+      <w:r>
+        <w:t>answer_with_context</w:t>
+      </w:r>
+      <w:proofErr w:type="spellEnd"/>
+      <w:r>
+        <w:t xml:space="preserve"> | verify | </w:t>
+      </w:r>
+      <w:proofErr w:type="spellStart"/>
+      <w:r>
+        <w:t>answer_direct</w:t>
+      </w:r>
+      <w:proofErr w:type="spellEnd"/>
+      <w:r>
+        <w:t>]</w:t>
+      </w:r>
+    </w:p>
+    <w:p>
+      <w:r>
+        <w:t>Copy</w:t>
+      </w:r>
+    </w:p>
+    <w:p>
+      <w:r>
+        <w:t>Every branch ends at </w:t>
+      </w:r>
+    </w:p>
+    <w:p>
+      <w:r>
+        <w:t>END</w:t>
+      </w:r>
+    </w:p>
+    <w:p>
+      <w:r>
+        <w:t>. The Retrieve branch has a smart post-retrieve check — it only calls Verify if contradiction is still high (&gt;0.3) after retrieval, avoiding unnecessary LLM calls.</w:t>
+      </w:r>
+    </w:p>
+    <w:p>
+      <w:r>
+        <w:pict w14:anchorId="1FB9EA07">
+          <v:rect id="_x0000_i1078" style="width:219.3pt;height:.75pt" o:hrpct="0" o:hralign="center" o:hrstd="t" o:hr="t" fillcolor="#a0a0a0" stroked="f"/>
+        </w:pict>
+      </w:r>
+    </w:p>
+    <w:p>
+      <w:pPr>
+        <w:rPr>
+          <w:b/>
+          <w:bCs/>
+        </w:rPr>
+      </w:pPr>
+      <w:r>
+        <w:rPr>
+          <w:b/>
+          <w:bCs/>
+        </w:rPr>
+        <w:t>Signal Pipeline (</w:t>
+      </w:r>
+    </w:p>
+    <w:p>
+      <w:pPr>
+        <w:rPr>
+          <w:b/>
+          <w:bCs/>
+        </w:rPr>
+      </w:pPr>
+      <w:proofErr w:type="spellStart"/>
+      <w:r>
+        <w:rPr>
+          <w:b/>
+          <w:bCs/>
+        </w:rPr>
+        <w:t>src</w:t>
+      </w:r>
+      <w:proofErr w:type="spellEnd"/>
+      <w:r>
+        <w:rPr>
+          <w:b/>
+          <w:bCs/>
+        </w:rPr>
+        <w:t>/signals/</w:t>
+      </w:r>
+    </w:p>
+    <w:p>
+      <w:pPr>
+        <w:rPr>
+          <w:b/>
+          <w:bCs/>
+        </w:rPr>
+      </w:pPr>
+      <w:r>
+        <w:rPr>
+          <w:b/>
+          <w:bCs/>
+        </w:rPr>
+        <w:t> + </w:t>
+      </w:r>
+    </w:p>
+    <w:p>
+      <w:pPr>
+        <w:rPr>
+          <w:b/>
+          <w:bCs/>
+        </w:rPr>
+      </w:pPr>
+      <w:proofErr w:type="spellStart"/>
+      <w:r>
+        <w:rPr>
+          <w:b/>
+          <w:bCs/>
+        </w:rPr>
+        <w:t>src</w:t>
+      </w:r>
+      <w:proofErr w:type="spellEnd"/>
+      <w:r>
+        <w:rPr>
+          <w:b/>
+          <w:bCs/>
+        </w:rPr>
+        <w:t>/uncertainty/</w:t>
+      </w:r>
+    </w:p>
+    <w:p>
+      <w:pPr>
+        <w:rPr>
+          <w:b/>
+          <w:bCs/>
+        </w:rPr>
+      </w:pPr>
+      <w:r>
+        <w:rPr>
+          <w:b/>
+          <w:bCs/>
+        </w:rPr>
+        <w:lastRenderedPageBreak/>
+        <w:t>)</w:t>
+      </w:r>
+    </w:p>
+    <w:tbl>
+      <w:tblPr>
+        <w:tblW w:w="4386" w:type="dxa"/>
+        <w:tblCellSpacing w:w="15" w:type="dxa"/>
+        <w:shd w:val="clear" w:color="auto" w:fill="191A1B"/>
+        <w:tblCellMar>
+          <w:top w:w="15" w:type="dxa"/>
+          <w:left w:w="15" w:type="dxa"/>
+          <w:bottom w:w="15" w:type="dxa"/>
+          <w:right w:w="15" w:type="dxa"/>
+        </w:tblCellMar>
+        <w:tblLook w:val="04A0" w:firstRow="1" w:lastRow="0" w:firstColumn="1" w:lastColumn="0" w:noHBand="0" w:noVBand="1"/>
+      </w:tblPr>
+      <w:tblGrid>
+        <w:gridCol w:w="1567"/>
+        <w:gridCol w:w="2819"/>
+      </w:tblGrid>
+      <w:tr>
+        <w:trPr>
+          <w:tblHeader/>
+          <w:tblCellSpacing w:w="15" w:type="dxa"/>
+        </w:trPr>
+        <w:tc>
+          <w:tcPr>
+            <w:tcW w:w="0" w:type="auto"/>
+            <w:shd w:val="clear" w:color="auto" w:fill="191A1B"/>
+            <w:vAlign w:val="center"/>
+            <w:hideMark/>
+          </w:tcPr>
+          <w:p>
+            <w:pPr>
+              <w:rPr>
+                <w:b/>
+                <w:bCs/>
+              </w:rPr>
+            </w:pPr>
+            <w:r>
+              <w:rPr>
+                <w:b/>
+                <w:bCs/>
+              </w:rPr>
+              <w:t>Signal</w:t>
+            </w:r>
+          </w:p>
+        </w:tc>
+        <w:tc>
+          <w:tcPr>
+            <w:tcW w:w="0" w:type="auto"/>
+            <w:shd w:val="clear" w:color="auto" w:fill="191A1B"/>
+            <w:vAlign w:val="center"/>
+            <w:hideMark/>
+          </w:tcPr>
+          <w:p>
+            <w:pPr>
+              <w:rPr>
+                <w:b/>
+                <w:bCs/>
+              </w:rPr>
+            </w:pPr>
+            <w:r>
+              <w:rPr>
+                <w:b/>
+                <w:bCs/>
+              </w:rPr>
+              <w:t>How it's computed</w:t>
+            </w:r>
+          </w:p>
+        </w:tc>
+      </w:tr>
+      <w:tr>
+        <w:trPr>
+          <w:tblCellSpacing w:w="15" w:type="dxa"/>
+        </w:trPr>
+        <w:tc>
+          <w:tcPr>
+            <w:tcW w:w="0" w:type="auto"/>
+            <w:shd w:val="clear" w:color="auto" w:fill="191A1B"/>
+            <w:vAlign w:val="center"/>
+            <w:hideMark/>
+          </w:tcPr>
+          <w:p>
+            <w:r>
+              <w:t>Self-consistency uncertainty</w:t>
+            </w:r>
+          </w:p>
+        </w:tc>
+        <w:tc>
+          <w:tcPr>
+            <w:tcW w:w="0" w:type="auto"/>
+            <w:shd w:val="clear" w:color="auto" w:fill="191A1B"/>
+            <w:vAlign w:val="center"/>
+            <w:hideMark/>
+          </w:tcPr>
+          <w:p>
+            <w:r>
+              <w:t>5 samples at temp=0.8 → embed with </w:t>
+            </w:r>
+          </w:p>
+          <w:p>
+            <w:r>
+              <w:t>bge-small-en-v1.5</w:t>
+            </w:r>
+          </w:p>
+          <w:p>
+            <w:r>
+              <w:t> → mean pairwise cosine similarity → </w:t>
+            </w:r>
+          </w:p>
+          <w:p>
+            <w:r>
+              <w:t>1 - sim</w:t>
+            </w:r>
+          </w:p>
+        </w:tc>
+      </w:tr>
+      <w:tr>
+        <w:trPr>
+          <w:tblCellSpacing w:w="15" w:type="dxa"/>
+        </w:trPr>
+        <w:tc>
+          <w:tcPr>
+            <w:tcW w:w="0" w:type="auto"/>
+            <w:shd w:val="clear" w:color="auto" w:fill="191A1B"/>
+            <w:vAlign w:val="center"/>
+            <w:hideMark/>
+          </w:tcPr>
+          <w:p>
+            <w:r>
+              <w:t>Self-eval uncertainty</w:t>
+            </w:r>
+          </w:p>
+        </w:tc>
+        <w:tc>
+          <w:tcPr>
+            <w:tcW w:w="0" w:type="auto"/>
+            <w:shd w:val="clear" w:color="auto" w:fill="191A1B"/>
+            <w:vAlign w:val="center"/>
+            <w:hideMark/>
+          </w:tcPr>
+          <w:p>
+            <w:r>
+              <w:t>P(True) + P(IK) via LLM prompts → </w:t>
+            </w:r>
+          </w:p>
+          <w:p>
+            <w:r>
+              <w:t xml:space="preserve">1 - </w:t>
+            </w:r>
+            <w:proofErr w:type="spellStart"/>
+            <w:r>
+              <w:t>avg</w:t>
+            </w:r>
+            <w:proofErr w:type="spellEnd"/>
+            <w:r>
+              <w:t>(</w:t>
+            </w:r>
+            <w:proofErr w:type="spellStart"/>
+            <w:r>
+              <w:t>p_true</w:t>
+            </w:r>
+            <w:proofErr w:type="spellEnd"/>
+            <w:r>
+              <w:t xml:space="preserve">, </w:t>
+            </w:r>
+            <w:proofErr w:type="spellStart"/>
+            <w:r>
+              <w:t>p_ik</w:t>
+            </w:r>
+            <w:proofErr w:type="spellEnd"/>
+            <w:r>
+              <w:t>)</w:t>
+            </w:r>
+          </w:p>
+        </w:tc>
+      </w:tr>
+      <w:tr>
+        <w:trPr>
+          <w:tblCellSpacing w:w="15" w:type="dxa"/>
+        </w:trPr>
+        <w:tc>
+          <w:tcPr>
+            <w:tcW w:w="0" w:type="auto"/>
+            <w:shd w:val="clear" w:color="auto" w:fill="191A1B"/>
+            <w:vAlign w:val="center"/>
+            <w:hideMark/>
+          </w:tcPr>
+          <w:p>
+            <w:r>
+              <w:t>Combined uncertainty</w:t>
+            </w:r>
+          </w:p>
+        </w:tc>
+        <w:tc>
+          <w:tcPr>
+            <w:tcW w:w="0" w:type="auto"/>
+            <w:shd w:val="clear" w:color="auto" w:fill="191A1B"/>
+            <w:vAlign w:val="center"/>
+            <w:hideMark/>
+          </w:tcPr>
+          <w:p>
+            <w:r>
+              <w:t xml:space="preserve">0.5 * </w:t>
+            </w:r>
+            <w:proofErr w:type="spellStart"/>
+            <w:r>
+              <w:t>self_consistency</w:t>
+            </w:r>
+            <w:proofErr w:type="spellEnd"/>
+            <w:r>
+              <w:t xml:space="preserve"> + 0.5 * </w:t>
+            </w:r>
+            <w:proofErr w:type="spellStart"/>
+            <w:r>
+              <w:t>self_eval</w:t>
+            </w:r>
+            <w:proofErr w:type="spellEnd"/>
+          </w:p>
+        </w:tc>
+      </w:tr>
+      <w:tr>
+        <w:trPr>
+          <w:tblCellSpacing w:w="15" w:type="dxa"/>
+        </w:trPr>
+        <w:tc>
+          <w:tcPr>
+            <w:tcW w:w="0" w:type="auto"/>
+            <w:shd w:val="clear" w:color="auto" w:fill="191A1B"/>
+            <w:vAlign w:val="center"/>
+            <w:hideMark/>
+          </w:tcPr>
+          <w:p>
+            <w:r>
+              <w:t>Evidence coverage</w:t>
+            </w:r>
+          </w:p>
+        </w:tc>
+        <w:tc>
+          <w:tcPr>
+            <w:tcW w:w="0" w:type="auto"/>
+            <w:shd w:val="clear" w:color="auto" w:fill="191A1B"/>
+            <w:vAlign w:val="center"/>
+            <w:hideMark/>
+          </w:tcPr>
+          <w:p>
+            <w:proofErr w:type="spellStart"/>
+            <w:r>
+              <w:t>ChromaDB</w:t>
+            </w:r>
+            <w:proofErr w:type="spellEnd"/>
+            <w:r>
+              <w:t xml:space="preserve"> retrieval → top-1 distance threshold (0.6)</w:t>
+            </w:r>
+          </w:p>
+        </w:tc>
+      </w:tr>
+      <w:tr>
+        <w:trPr>
+          <w:tblCellSpacing w:w="15" w:type="dxa"/>
+        </w:trPr>
+        <w:tc>
+          <w:tcPr>
+            <w:tcW w:w="0" w:type="auto"/>
+            <w:shd w:val="clear" w:color="auto" w:fill="191A1B"/>
+            <w:vAlign w:val="center"/>
+            <w:hideMark/>
+          </w:tcPr>
+          <w:p>
+            <w:r>
+              <w:t>Evidence support</w:t>
+            </w:r>
+          </w:p>
+        </w:tc>
+        <w:tc>
+          <w:tcPr>
+            <w:tcW w:w="0" w:type="auto"/>
+            <w:shd w:val="clear" w:color="auto" w:fill="191A1B"/>
+            <w:vAlign w:val="center"/>
+            <w:hideMark/>
+          </w:tcPr>
+          <w:p>
+            <w:proofErr w:type="spellStart"/>
+            <w:r>
+              <w:t>bge</w:t>
+            </w:r>
+            <w:proofErr w:type="spellEnd"/>
+            <w:r>
+              <w:t>-</w:t>
+            </w:r>
+            <w:proofErr w:type="spellStart"/>
+            <w:r>
+              <w:t>reranker</w:t>
+            </w:r>
+            <w:proofErr w:type="spellEnd"/>
+            <w:r>
+              <w:t>-base</w:t>
+            </w:r>
+          </w:p>
+          <w:p>
+            <w:r>
+              <w:t> cross-encoder sigmoid score</w:t>
+            </w:r>
+          </w:p>
+        </w:tc>
+      </w:tr>
+      <w:tr>
+        <w:trPr>
+          <w:tblCellSpacing w:w="15" w:type="dxa"/>
+        </w:trPr>
+        <w:tc>
+          <w:tcPr>
+            <w:tcW w:w="0" w:type="auto"/>
+            <w:shd w:val="clear" w:color="auto" w:fill="191A1B"/>
+            <w:vAlign w:val="center"/>
+            <w:hideMark/>
+          </w:tcPr>
+          <w:p>
+            <w:r>
+              <w:t>Contradiction</w:t>
+            </w:r>
+          </w:p>
+        </w:tc>
+        <w:tc>
+          <w:tcPr>
+            <w:tcW w:w="0" w:type="auto"/>
+            <w:shd w:val="clear" w:color="auto" w:fill="191A1B"/>
+            <w:vAlign w:val="center"/>
+            <w:hideMark/>
+          </w:tcPr>
+          <w:p>
+            <w:r>
+              <w:t>cross-encoder/nli-deberta-v3-base</w:t>
+            </w:r>
+          </w:p>
+          <w:p>
+            <w:r>
+              <w:t xml:space="preserve"> → </w:t>
+            </w:r>
+            <w:proofErr w:type="spellStart"/>
+            <w:r>
+              <w:t>softmax</w:t>
+            </w:r>
+            <w:proofErr w:type="spellEnd"/>
+            <w:r>
+              <w:t xml:space="preserve"> over [contradiction, entailment, neutral]</w:t>
+            </w:r>
+          </w:p>
+        </w:tc>
+      </w:tr>
+      <w:tr>
+        <w:trPr>
+          <w:tblCellSpacing w:w="15" w:type="dxa"/>
+        </w:trPr>
+        <w:tc>
+          <w:tcPr>
+            <w:tcW w:w="0" w:type="auto"/>
+            <w:shd w:val="clear" w:color="auto" w:fill="191A1B"/>
+            <w:vAlign w:val="center"/>
+            <w:hideMark/>
+          </w:tcPr>
+          <w:p>
+            <w:r>
+              <w:t>Ambiguity</w:t>
+            </w:r>
+          </w:p>
+        </w:tc>
+        <w:tc>
+          <w:tcPr>
+            <w:tcW w:w="0" w:type="auto"/>
+            <w:shd w:val="clear" w:color="auto" w:fill="191A1B"/>
+            <w:vAlign w:val="center"/>
+            <w:hideMark/>
+          </w:tcPr>
+          <w:p>
+            <w:r>
+              <w:t xml:space="preserve">LLM-prompted score 0–100 (only true ambiguity, not </w:t>
+            </w:r>
+            <w:proofErr w:type="spellStart"/>
+            <w:r>
+              <w:t>unanswerability</w:t>
+            </w:r>
+            <w:proofErr w:type="spellEnd"/>
+            <w:r>
+              <w:t>)</w:t>
+            </w:r>
+          </w:p>
+        </w:tc>
+      </w:tr>
+      <w:tr>
+        <w:trPr>
+          <w:tblCellSpacing w:w="15" w:type="dxa"/>
+        </w:trPr>
+        <w:tc>
+          <w:tcPr>
+            <w:tcW w:w="0" w:type="auto"/>
+            <w:shd w:val="clear" w:color="auto" w:fill="191A1B"/>
+            <w:vAlign w:val="center"/>
+            <w:hideMark/>
+          </w:tcPr>
+          <w:p>
+            <w:r>
+              <w:t>Complexity</w:t>
+            </w:r>
+          </w:p>
+        </w:tc>
+        <w:tc>
+          <w:tcPr>
+            <w:tcW w:w="0" w:type="auto"/>
+            <w:shd w:val="clear" w:color="auto" w:fill="191A1B"/>
+            <w:vAlign w:val="center"/>
+            <w:hideMark/>
+          </w:tcPr>
+          <w:p>
+            <w:r>
+              <w:t>Rule-based: word count + multi-hop cues + named entities + time-sensitivity flags</w:t>
+            </w:r>
+          </w:p>
+        </w:tc>
+      </w:tr>
+    </w:tbl>
+    <w:p>
+      <w:r>
+        <w:pict w14:anchorId="3A53CAC9">
+          <v:rect id="_x0000_i1079" style="width:219.3pt;height:.75pt" o:hrpct="0" o:hralign="center" o:hrstd="t" o:hr="t" fillcolor="#a0a0a0" stroked="f"/>
+        </w:pict>
+      </w:r>
+    </w:p>
+    <w:p>
+      <w:pPr>
+        <w:rPr>
+          <w:b/>
+          <w:bCs/>
+        </w:rPr>
+      </w:pPr>
+      <w:r>
+        <w:rPr>
+          <w:b/>
+          <w:bCs/>
+        </w:rPr>
+        <w:t>Decision Policy (</w:t>
+      </w:r>
+    </w:p>
+    <w:p>
+      <w:pPr>
+        <w:rPr>
+          <w:b/>
+          <w:bCs/>
+        </w:rPr>
+      </w:pPr>
+      <w:r>
+        <w:rPr>
+          <w:b/>
+          <w:bCs/>
+        </w:rPr>
+        <w:t>src/policy/decision_policy.py</w:t>
+      </w:r>
+    </w:p>
+    <w:p>
+      <w:pPr>
+        <w:rPr>
+          <w:b/>
+          <w:bCs/>
+        </w:rPr>
+      </w:pPr>
+      <w:r>
+        <w:rPr>
+          <w:b/>
+          <w:bCs/>
+        </w:rPr>
+        <w:t>)</w:t>
+      </w:r>
+    </w:p>
+    <w:p>
+      <w:r>
+        <w:t xml:space="preserve">A* = </w:t>
+      </w:r>
+      <w:proofErr w:type="spellStart"/>
+      <w:r>
+        <w:t>argmax_A</w:t>
+      </w:r>
+      <w:proofErr w:type="spellEnd"/>
+      <w:r>
+        <w:t xml:space="preserve"> [ Reliability(A) - λ · Cost(A) ]</w:t>
+      </w:r>
+    </w:p>
+    <w:p>
+      <w:r>
+        <w:t>Copy</w:t>
+      </w:r>
+    </w:p>
+    <w:p>
+      <w:pPr>
+        <w:numPr>
+          <w:ilvl w:val="0"/>
+          <w:numId w:val="3"/>
+        </w:numPr>
+      </w:pPr>
+      <w:r>
+        <w:lastRenderedPageBreak/>
+        <w:t>λ = 0.05 (empirically tuned via lambda sweep)</w:t>
+      </w:r>
+    </w:p>
+    <w:p>
+      <w:pPr>
+        <w:numPr>
+          <w:ilvl w:val="0"/>
+          <w:numId w:val="3"/>
+        </w:numPr>
+      </w:pPr>
+      <w:r>
+        <w:t>Action costs: answer=1.0, retrieve=1.3, verify=1.6, clarify=1.0, abstain=0.0</w:t>
+      </w:r>
+    </w:p>
+    <w:p>
+      <w:pPr>
+        <w:numPr>
+          <w:ilvl w:val="0"/>
+          <w:numId w:val="3"/>
+        </w:numPr>
+      </w:pPr>
+      <w:r>
+        <w:t>Key design: </w:t>
+      </w:r>
+    </w:p>
+    <w:p>
+      <w:r>
+        <w:t>retrieve</w:t>
+      </w:r>
+    </w:p>
+    <w:p>
+      <w:r>
+        <w:t xml:space="preserve"> is NOT gated by </w:t>
+      </w:r>
+      <w:proofErr w:type="spellStart"/>
+      <w:r>
+        <w:t>evidence_coverage</w:t>
+      </w:r>
+      <w:proofErr w:type="spellEnd"/>
+      <w:r>
+        <w:t xml:space="preserve"> (catch-22 — evidence doesn't exist before retrieval). </w:t>
+      </w:r>
+    </w:p>
+    <w:p>
+      <w:r>
+        <w:t>verify</w:t>
+      </w:r>
+    </w:p>
+    <w:p>
+      <w:r>
+        <w:t> IS gated. </w:t>
+      </w:r>
+    </w:p>
+    <w:p>
+      <w:r>
+        <w:t>abstain</w:t>
+      </w:r>
+    </w:p>
+    <w:p>
+      <w:r>
+        <w:t> only fires on uncertain + simple + no evidence.</w:t>
+      </w:r>
+    </w:p>
+    <w:p>
+      <w:pPr>
+        <w:numPr>
+          <w:ilvl w:val="0"/>
+          <w:numId w:val="3"/>
+        </w:numPr>
+      </w:pPr>
+      <w:proofErr w:type="spellStart"/>
+      <w:r>
+        <w:t>XGBoost</w:t>
+      </w:r>
+      <w:proofErr w:type="spellEnd"/>
+      <w:r>
+        <w:t xml:space="preserve"> classifier trained on top of the rule-based scores as a refinement layer (10 features → 5 action classes)</w:t>
+      </w:r>
+    </w:p>
+    <w:p>
+      <w:r>
+        <w:pict w14:anchorId="3B975C5C">
+          <v:rect id="_x0000_i1080" style="width:219.3pt;height:.75pt" o:hrpct="0" o:hralign="center" o:hrstd="t" o:hr="t" fillcolor="#a0a0a0" stroked="f"/>
+        </w:pict>
+      </w:r>
+    </w:p>
+    <w:p>
+      <w:pPr>
+        <w:rPr>
+          <w:b/>
+          <w:bCs/>
+        </w:rPr>
+      </w:pPr>
+      <w:r>
+        <w:rPr>
+          <w:b/>
+          <w:bCs/>
+        </w:rPr>
+        <w:t>LLM Stack</w:t>
+      </w:r>
+    </w:p>
+    <w:p>
+      <w:pPr>
+        <w:numPr>
+          <w:ilvl w:val="0"/>
+          <w:numId w:val="4"/>
+        </w:numPr>
+      </w:pPr>
+      <w:r>
+        <w:t xml:space="preserve">Primary: </w:t>
+      </w:r>
+      <w:proofErr w:type="spellStart"/>
+      <w:r>
+        <w:t>Ollama</w:t>
+      </w:r>
+      <w:proofErr w:type="spellEnd"/>
+      <w:r>
+        <w:t> </w:t>
+      </w:r>
+    </w:p>
+    <w:p>
+      <w:r>
+        <w:t>llama3:8b</w:t>
+      </w:r>
+    </w:p>
+    <w:p>
+      <w:r>
+        <w:t> (local)</w:t>
+      </w:r>
+    </w:p>
+    <w:p>
+      <w:pPr>
+        <w:numPr>
+          <w:ilvl w:val="0"/>
+          <w:numId w:val="4"/>
+        </w:numPr>
+      </w:pPr>
+      <w:r>
+        <w:t xml:space="preserve">Fallback: </w:t>
+      </w:r>
+      <w:proofErr w:type="spellStart"/>
+      <w:r>
+        <w:t>Groq</w:t>
+      </w:r>
+      <w:proofErr w:type="spellEnd"/>
+      <w:r>
+        <w:t> </w:t>
+      </w:r>
+    </w:p>
+    <w:p>
+      <w:r>
+        <w:t>llama-3.1-8b-instant</w:t>
+      </w:r>
+    </w:p>
+    <w:p>
+      <w:pPr>
+        <w:numPr>
+          <w:ilvl w:val="0"/>
+          <w:numId w:val="4"/>
+        </w:numPr>
+      </w:pPr>
+      <w:r>
+        <w:t xml:space="preserve">Also wired: </w:t>
+      </w:r>
+      <w:proofErr w:type="spellStart"/>
+      <w:r>
+        <w:t>HuggingFace</w:t>
+      </w:r>
+      <w:proofErr w:type="spellEnd"/>
+      <w:r>
+        <w:t> </w:t>
+      </w:r>
+    </w:p>
+    <w:p>
+      <w:r>
+        <w:t>Qwen2.5-72B-Instruct</w:t>
+      </w:r>
+    </w:p>
+    <w:p>
+      <w:pPr>
+        <w:numPr>
+          <w:ilvl w:val="0"/>
+          <w:numId w:val="4"/>
+        </w:numPr>
+      </w:pPr>
+      <w:r>
+        <w:t xml:space="preserve">Vector store: </w:t>
+      </w:r>
+      <w:proofErr w:type="spellStart"/>
+      <w:r>
+        <w:t>ChromaDB</w:t>
+      </w:r>
+      <w:proofErr w:type="spellEnd"/>
+      <w:r>
+        <w:t xml:space="preserve"> (persistent) with </w:t>
+      </w:r>
+    </w:p>
+    <w:p>
+      <w:r>
+        <w:t>bge-small-en-v1.5</w:t>
+      </w:r>
+    </w:p>
+    <w:p>
+      <w:r>
+        <w:t> embeddings</w:t>
+      </w:r>
+    </w:p>
+    <w:p>
+      <w:r>
+        <w:pict w14:anchorId="38BEF902">
+          <v:rect id="_x0000_i1081" style="width:219.3pt;height:.75pt" o:hrpct="0" o:hralign="center" o:hrstd="t" o:hr="t" fillcolor="#a0a0a0" stroked="f"/>
+        </w:pict>
+      </w:r>
+    </w:p>
+    <w:p>
+      <w:pPr>
+        <w:rPr>
+          <w:b/>
+          <w:bCs/>
+        </w:rPr>
+      </w:pPr>
+      <w:r>
+        <w:rPr>
+          <w:b/>
+          <w:bCs/>
+        </w:rPr>
+        <w:t>Baselines (</w:t>
+      </w:r>
+    </w:p>
+    <w:p>
+      <w:pPr>
+        <w:rPr>
+          <w:b/>
+          <w:bCs/>
+        </w:rPr>
+      </w:pPr>
+      <w:proofErr w:type="spellStart"/>
+      <w:r>
+        <w:rPr>
+          <w:b/>
+          <w:bCs/>
+        </w:rPr>
+        <w:t>src</w:t>
+      </w:r>
+      <w:proofErr w:type="spellEnd"/>
+      <w:r>
+        <w:rPr>
+          <w:b/>
+          <w:bCs/>
+        </w:rPr>
+        <w:t>/baselines/</w:t>
+      </w:r>
+    </w:p>
+    <w:p>
+      <w:pPr>
+        <w:rPr>
+          <w:b/>
+          <w:bCs/>
+        </w:rPr>
+      </w:pPr>
+      <w:r>
+        <w:rPr>
+          <w:b/>
+          <w:bCs/>
+        </w:rPr>
+        <w:t>)</w:t>
+      </w:r>
+    </w:p>
+    <w:tbl>
+      <w:tblPr>
+        <w:tblW w:w="4386" w:type="dxa"/>
+        <w:tblCellSpacing w:w="15" w:type="dxa"/>
+        <w:shd w:val="clear" w:color="auto" w:fill="191A1B"/>
+        <w:tblCellMar>
+          <w:top w:w="15" w:type="dxa"/>
+          <w:left w:w="15" w:type="dxa"/>
+          <w:bottom w:w="15" w:type="dxa"/>
+          <w:right w:w="15" w:type="dxa"/>
+        </w:tblCellMar>
+        <w:tblLook w:val="04A0" w:firstRow="1" w:lastRow="0" w:firstColumn="1" w:lastColumn="0" w:noHBand="0" w:noVBand="1"/>
+      </w:tblPr>
+      <w:tblGrid>
+        <w:gridCol w:w="1123"/>
+        <w:gridCol w:w="3263"/>
+      </w:tblGrid>
+      <w:tr>
+        <w:trPr>
+          <w:tblHeader/>
+          <w:tblCellSpacing w:w="15" w:type="dxa"/>
+        </w:trPr>
+        <w:tc>
+          <w:tcPr>
+            <w:tcW w:w="0" w:type="auto"/>
+            <w:shd w:val="clear" w:color="auto" w:fill="191A1B"/>
+            <w:vAlign w:val="center"/>
+            <w:hideMark/>
+          </w:tcPr>
+          <w:p>
+            <w:pPr>
+              <w:rPr>
+                <w:b/>
+                <w:bCs/>
+              </w:rPr>
+            </w:pPr>
+            <w:r>
+              <w:rPr>
+                <w:b/>
+                <w:bCs/>
+              </w:rPr>
+              <w:t>Baseline</w:t>
+            </w:r>
+          </w:p>
+        </w:tc>
+        <w:tc>
+          <w:tcPr>
+            <w:tcW w:w="0" w:type="auto"/>
+            <w:shd w:val="clear" w:color="auto" w:fill="191A1B"/>
+            <w:vAlign w:val="center"/>
+            <w:hideMark/>
+          </w:tcPr>
+          <w:p>
+            <w:pPr>
+              <w:rPr>
+                <w:b/>
+                <w:bCs/>
+              </w:rPr>
+            </w:pPr>
+            <w:r>
+              <w:rPr>
+                <w:b/>
+                <w:bCs/>
+              </w:rPr>
+              <w:t>Strategy</w:t>
+            </w:r>
+          </w:p>
+        </w:tc>
+      </w:tr>
+      <w:tr>
+        <w:trPr>
+          <w:tblCellSpacing w:w="15" w:type="dxa"/>
+        </w:trPr>
+        <w:tc>
+          <w:tcPr>
+            <w:tcW w:w="0" w:type="auto"/>
+            <w:shd w:val="clear" w:color="auto" w:fill="191A1B"/>
+            <w:vAlign w:val="center"/>
+            <w:hideMark/>
+          </w:tcPr>
+          <w:p>
+            <w:r>
+              <w:t>Normal LLM</w:t>
+            </w:r>
+          </w:p>
+        </w:tc>
+        <w:tc>
+          <w:tcPr>
+            <w:tcW w:w="0" w:type="auto"/>
+            <w:shd w:val="clear" w:color="auto" w:fill="191A1B"/>
+            <w:vAlign w:val="center"/>
+            <w:hideMark/>
+          </w:tcPr>
+          <w:p>
+            <w:r>
+              <w:t>Direct answer, no uncertainty awareness</w:t>
+            </w:r>
+          </w:p>
+        </w:tc>
+      </w:tr>
+      <w:tr>
+        <w:trPr>
+          <w:tblCellSpacing w:w="15" w:type="dxa"/>
+        </w:trPr>
+        <w:tc>
+          <w:tcPr>
+            <w:tcW w:w="0" w:type="auto"/>
+            <w:shd w:val="clear" w:color="auto" w:fill="191A1B"/>
+            <w:vAlign w:val="center"/>
+            <w:hideMark/>
+          </w:tcPr>
+          <w:p>
+            <w:r>
+              <w:lastRenderedPageBreak/>
+              <w:t>Standard RAG</w:t>
+            </w:r>
+          </w:p>
+        </w:tc>
+        <w:tc>
+          <w:tcPr>
+            <w:tcW w:w="0" w:type="auto"/>
+            <w:shd w:val="clear" w:color="auto" w:fill="191A1B"/>
+            <w:vAlign w:val="center"/>
+            <w:hideMark/>
+          </w:tcPr>
+          <w:p>
+            <w:r>
+              <w:t>Always retrieves k=3 docs, then answers</w:t>
+            </w:r>
+          </w:p>
+        </w:tc>
+      </w:tr>
+      <w:tr>
+        <w:trPr>
+          <w:tblCellSpacing w:w="15" w:type="dxa"/>
+        </w:trPr>
+        <w:tc>
+          <w:tcPr>
+            <w:tcW w:w="0" w:type="auto"/>
+            <w:shd w:val="clear" w:color="auto" w:fill="191A1B"/>
+            <w:vAlign w:val="center"/>
+            <w:hideMark/>
+          </w:tcPr>
+          <w:p>
+            <w:r>
+              <w:t>Self-reflection</w:t>
+            </w:r>
+          </w:p>
+        </w:tc>
+        <w:tc>
+          <w:tcPr>
+            <w:tcW w:w="0" w:type="auto"/>
+            <w:shd w:val="clear" w:color="auto" w:fill="191A1B"/>
+            <w:vAlign w:val="center"/>
+            <w:hideMark/>
+          </w:tcPr>
+          <w:p>
+            <w:r>
+              <w:t>Generate → Critique → Revise (2 LLM calls)</w:t>
+            </w:r>
+          </w:p>
+        </w:tc>
+      </w:tr>
+      <w:tr>
+        <w:trPr>
+          <w:tblCellSpacing w:w="15" w:type="dxa"/>
+        </w:trPr>
+        <w:tc>
+          <w:tcPr>
+            <w:tcW w:w="0" w:type="auto"/>
+            <w:shd w:val="clear" w:color="auto" w:fill="191A1B"/>
+            <w:vAlign w:val="center"/>
+            <w:hideMark/>
+          </w:tcPr>
+          <w:p>
+            <w:r>
+              <w:t>Fixed-threshold</w:t>
+            </w:r>
+          </w:p>
+        </w:tc>
+        <w:tc>
+          <w:tcPr>
+            <w:tcW w:w="0" w:type="auto"/>
+            <w:shd w:val="clear" w:color="auto" w:fill="191A1B"/>
+            <w:vAlign w:val="center"/>
+            <w:hideMark/>
+          </w:tcPr>
+          <w:p>
+            <w:r>
+              <w:t>Same uncertainty calc as adaptive agent, but single cutoff → retrieve or answer</w:t>
+            </w:r>
+          </w:p>
+        </w:tc>
+      </w:tr>
+    </w:tbl>
+    <w:p>
+      <w:r>
+        <w:t xml:space="preserve">All share the same LLM and </w:t>
+      </w:r>
+      <w:proofErr w:type="spellStart"/>
+      <w:r>
+        <w:t>ChromaDB</w:t>
+      </w:r>
+      <w:proofErr w:type="spellEnd"/>
+      <w:r>
+        <w:t xml:space="preserve"> interface for fair comparison.</w:t>
+      </w:r>
+    </w:p>
+    <w:p>
+      <w:r>
+        <w:pict w14:anchorId="1163956D">
+          <v:rect id="_x0000_i1082" style="width:219.3pt;height:.75pt" o:hrpct="0" o:hralign="center" o:hrstd="t" o:hr="t" fillcolor="#a0a0a0" stroked="f"/>
+        </w:pict>
+      </w:r>
+    </w:p>
+    <w:p>
+      <w:pPr>
+        <w:rPr>
+          <w:b/>
+          <w:bCs/>
+        </w:rPr>
+      </w:pPr>
+      <w:r>
+        <w:rPr>
+          <w:b/>
+          <w:bCs/>
+        </w:rPr>
+        <w:t>Evaluation (</w:t>
+      </w:r>
+    </w:p>
+    <w:p>
+      <w:pPr>
+        <w:rPr>
+          <w:b/>
+          <w:bCs/>
+        </w:rPr>
+      </w:pPr>
+      <w:proofErr w:type="spellStart"/>
+      <w:r>
+        <w:rPr>
+          <w:b/>
+          <w:bCs/>
+        </w:rPr>
+        <w:t>src</w:t>
+      </w:r>
+      <w:proofErr w:type="spellEnd"/>
+      <w:r>
+        <w:rPr>
+          <w:b/>
+          <w:bCs/>
+        </w:rPr>
+        <w:t>/eval/</w:t>
+      </w:r>
+    </w:p>
+    <w:p>
+      <w:pPr>
+        <w:rPr>
+          <w:b/>
+          <w:bCs/>
+        </w:rPr>
+      </w:pPr>
+      <w:r>
+        <w:rPr>
+          <w:b/>
+          <w:bCs/>
+        </w:rPr>
+        <w:t>)</w:t>
+      </w:r>
+    </w:p>
+    <w:p>
+      <w:pPr>
+        <w:numPr>
+          <w:ilvl w:val="0"/>
+          <w:numId w:val="5"/>
+        </w:numPr>
+      </w:pPr>
+      <w:r>
+        <w:t xml:space="preserve">Tier 1: Accuracy, hallucination rate, </w:t>
+      </w:r>
+      <w:proofErr w:type="spellStart"/>
+      <w:r>
+        <w:t>groundedness</w:t>
+      </w:r>
+      <w:proofErr w:type="spellEnd"/>
+    </w:p>
+    <w:p>
+      <w:pPr>
+        <w:numPr>
+          <w:ilvl w:val="0"/>
+          <w:numId w:val="5"/>
+        </w:numPr>
+      </w:pPr>
+      <w:r>
+        <w:t>Tier 2: ECE, Brier score, AUROC (hallucination detection)</w:t>
+      </w:r>
+    </w:p>
+    <w:p>
+      <w:pPr>
+        <w:numPr>
+          <w:ilvl w:val="0"/>
+          <w:numId w:val="5"/>
+        </w:numPr>
+      </w:pPr>
+      <w:r>
+        <w:t>Tier 3: Action accuracy, per-action precision/recall, unnecessary retrieval rate</w:t>
+      </w:r>
+    </w:p>
+    <w:p>
+      <w:pPr>
+        <w:numPr>
+          <w:ilvl w:val="0"/>
+          <w:numId w:val="5"/>
+        </w:numPr>
+      </w:pPr>
+      <w:r>
+        <w:t>Tier 4: Token usage, LLM calls, latency</w:t>
+      </w:r>
+    </w:p>
+    <w:p>
+      <w:pPr>
+        <w:numPr>
+          <w:ilvl w:val="0"/>
+          <w:numId w:val="5"/>
+        </w:numPr>
+      </w:pPr>
+      <w:r>
+        <w:t xml:space="preserve">Plus: RAGAS (faithfulness + answer relevancy), </w:t>
+      </w:r>
+      <w:proofErr w:type="spellStart"/>
+      <w:r>
+        <w:t>DeepEval</w:t>
+      </w:r>
+      <w:proofErr w:type="spellEnd"/>
+      <w:r>
+        <w:t>, threshold sweep (λ=0.1–0.9 → reliability–cost curve), signal ablation (remove one signal at a time)</w:t>
+      </w:r>
+    </w:p>
+    <w:p>
+      <w:r>
+        <w:pict w14:anchorId="346825F4">
+          <v:rect id="_x0000_i1083" style="width:219.3pt;height:.75pt" o:hrpct="0" o:hralign="center" o:hrstd="t" o:hr="t" fillcolor="#a0a0a0" stroked="f"/>
+        </w:pict>
+      </w:r>
+    </w:p>
+    <w:p>
+      <w:pPr>
+        <w:rPr>
+          <w:b/>
+          <w:bCs/>
+        </w:rPr>
+      </w:pPr>
+      <w:r>
+        <w:rPr>
+          <w:b/>
+          <w:bCs/>
+        </w:rPr>
+        <w:t>Data</w:t>
+      </w:r>
+    </w:p>
+    <w:p>
+      <w:pPr>
+        <w:numPr>
+          <w:ilvl w:val="0"/>
+          <w:numId w:val="6"/>
+        </w:numPr>
+      </w:pPr>
+      <w:r>
+        <w:t>5 public datasets in </w:t>
+      </w:r>
+    </w:p>
+    <w:p>
+      <w:r>
+        <w:t>data/raw/</w:t>
+      </w:r>
+    </w:p>
+    <w:p>
+      <w:r>
+        <w:t xml:space="preserve">: </w:t>
+      </w:r>
+      <w:proofErr w:type="spellStart"/>
+      <w:r>
+        <w:t>SimpleQA</w:t>
+      </w:r>
+      <w:proofErr w:type="spellEnd"/>
+      <w:r>
+        <w:t xml:space="preserve">, </w:t>
+      </w:r>
+      <w:proofErr w:type="spellStart"/>
+      <w:r>
+        <w:t>SQuAD</w:t>
+      </w:r>
+      <w:proofErr w:type="spellEnd"/>
+      <w:r>
+        <w:t xml:space="preserve"> 2.0, </w:t>
+      </w:r>
+      <w:proofErr w:type="spellStart"/>
+      <w:r>
+        <w:t>AmbigQA</w:t>
+      </w:r>
+      <w:proofErr w:type="spellEnd"/>
+      <w:r>
+        <w:t xml:space="preserve">, </w:t>
+      </w:r>
+      <w:proofErr w:type="spellStart"/>
+      <w:r>
+        <w:t>HotpotQA</w:t>
+      </w:r>
+      <w:proofErr w:type="spellEnd"/>
+      <w:r>
+        <w:t xml:space="preserve">, </w:t>
+      </w:r>
+      <w:proofErr w:type="spellStart"/>
+      <w:r>
+        <w:t>HaluEval</w:t>
+      </w:r>
+      <w:proofErr w:type="spellEnd"/>
+    </w:p>
+    <w:p>
+      <w:pPr>
+        <w:numPr>
+          <w:ilvl w:val="0"/>
+          <w:numId w:val="6"/>
+        </w:numPr>
+      </w:pPr>
+      <w:r>
+        <w:t>Custom decision dataset (</w:t>
+      </w:r>
+    </w:p>
+    <w:p>
+      <w:proofErr w:type="spellStart"/>
+      <w:r>
+        <w:t>custom_decision_dataset.jsonl</w:t>
+      </w:r>
+      <w:proofErr w:type="spellEnd"/>
+    </w:p>
+    <w:p>
+      <w:r>
+        <w:t>) — 1000–2000 </w:t>
+      </w:r>
+    </w:p>
+    <w:p>
+      <w:r>
+        <w:t xml:space="preserve">(query → </w:t>
+      </w:r>
+      <w:proofErr w:type="spellStart"/>
+      <w:r>
+        <w:t>expected_action</w:t>
+      </w:r>
+      <w:proofErr w:type="spellEnd"/>
+      <w:r>
+        <w:t>)</w:t>
+      </w:r>
+    </w:p>
+    <w:p>
+      <w:r>
+        <w:t> labelled pairs — the core research contribution</w:t>
+      </w:r>
+    </w:p>
+    <w:p>
+      <w:pPr>
+        <w:numPr>
+          <w:ilvl w:val="0"/>
+          <w:numId w:val="6"/>
+        </w:numPr>
+      </w:pPr>
+      <w:r>
+        <w:t xml:space="preserve">Trained </w:t>
+      </w:r>
+      <w:proofErr w:type="spellStart"/>
+      <w:r>
+        <w:t>XGBoost</w:t>
+      </w:r>
+      <w:proofErr w:type="spellEnd"/>
+      <w:r>
+        <w:t xml:space="preserve"> policy saved to </w:t>
+      </w:r>
+    </w:p>
+    <w:p>
+      <w:r>
+        <w:t>data/processed/</w:t>
+      </w:r>
+      <w:proofErr w:type="spellStart"/>
+      <w:r>
+        <w:t>policy_classifier.joblib</w:t>
+      </w:r>
+      <w:proofErr w:type="spellEnd"/>
     </w:p>
     <w:p/>
     <w:sectPr>
@@ -4124,9 +5749,9 @@
 <file path=word/numbering.xml><?xml version="1.0" encoding="utf-8"?>
 <w:numbering xmlns:wpc="http://schemas.microsoft.com/office/word/2010/wordprocessingCanvas" xmlns:cx="http://schemas.microsoft.com/office/drawing/2014/chartex" xmlns:cx1="http://schemas.microsoft.com/office/drawing/2015/9/8/chartex" xmlns:cx2="http://schemas.microsoft.com/office/drawing/2015/10/21/chartex" xmlns:cx3="http://schemas.microsoft.com/office/drawing/2016/5/9/chartex" xmlns:cx4="http://schemas.microsoft.com/office/drawing/2016/5/10/chartex" xmlns:cx5="http://schemas.microsoft.com/office/drawing/2016/5/11/chartex" xmlns:cx6="http://schemas.microsoft.com/office/drawing/2016/5/12/chartex" xmlns:cx7="http://schemas.microsoft.com/office/drawing/2016/5/13/chartex" xmlns:cx8="http://schemas.microsoft.com/office/drawing/2016/5/14/chartex" xmlns:mc="http://schemas.openxmlformats.org/markup-compatibility/2006" xmlns:aink="http://schemas.microsoft.com/office/drawing/2016/ink" xmlns:am3d="http://schemas.microsoft.com/office/drawing/2017/model3d" xmlns:o="urn:schemas-microsoft-com:office:office" xmlns:oel="http://schemas.microsoft.com/office/2019/extlst" xmlns:r="http://schemas.openxmlformats.org/officeDocument/2006/relationships" xmlns:m="http://schemas.openxmlformats.org/officeDocument/2006/math" xmlns:v="urn:schemas-microsoft-com:vml" xmlns:wp14="http://schemas.microsoft.com/office/word/2010/wordprocessingDrawing" xmlns:wp="http://schemas.openxmlformats.org/drawingml/2006/wordprocessingDrawing" xmlns:w10="urn:schemas-microsoft-com:office:word" xmlns:w="http://schemas.openxmlformats.org/wordprocessingml/2006/main" xmlns:w14="http://schemas.microsoft.com/office/word/2010/wordml" xmlns:w15="http://schemas.microsoft.com/office/word/2012/wordml" xmlns:w16cex="http://schemas.microsoft.com/office/word/2018/wordml/cex" xmlns:w16cid="http://schemas.microsoft.com/office/word/2016/wordml/cid" xmlns:w16="http://schemas.microsoft.com/office/word/2018/wordml" xmlns:w16du="http://schemas.microsoft.com/office/word/2023/wordml/word16du" xmlns:w16sdtdh="http://schemas.microsoft.com/office/word/2020/wordml/sdtdatahash" xmlns:w16sdtfl="http://schemas.microsoft.com/office/word/2024/wordml/sdtformatlock" xmlns:w16se="http://schemas.microsoft.com/office/word/2015/wordml/symex" xmlns:wpg="http://schemas.microsoft.com/office/word/2010/wordprocessingGroup" xmlns:wpi="http://schemas.microsoft.com/office/word/2010/wordprocessingInk" xmlns:wne="http://schemas.microsoft.com/office/word/2006/wordml" xmlns:wps="http://schemas.microsoft.com/office/word/2010/wordprocessingShape" mc:Ignorable="w14 w15 w16se w16cid w16 w16cex w16sdtdh w16sdtfl w16du wp14">
   <w:abstractNum w:abstractNumId="0" w15:restartNumberingAfterBreak="0">
-    <w:nsid w:val="4246266A"/>
+    <w:nsid w:val="14A93A2B"/>
     <w:multiLevelType w:val="multilevel"/>
-    <w:tmpl w:val="C096E4DE"/>
+    <w:tmpl w:val="7756ABD6"/>
     <w:lvl w:ilvl="0">
       <w:start w:val="1"/>
       <w:numFmt w:val="bullet"/>
@@ -4273,9 +5898,9 @@
     </w:lvl>
   </w:abstractNum>
   <w:abstractNum w:abstractNumId="1" w15:restartNumberingAfterBreak="0">
-    <w:nsid w:val="51C54314"/>
+    <w:nsid w:val="4246266A"/>
     <w:multiLevelType w:val="multilevel"/>
-    <w:tmpl w:val="3D2E8554"/>
+    <w:tmpl w:val="C096E4DE"/>
     <w:lvl w:ilvl="0">
       <w:start w:val="1"/>
       <w:numFmt w:val="bullet"/>
@@ -4421,11 +6046,619 @@
       </w:rPr>
     </w:lvl>
   </w:abstractNum>
+  <w:abstractNum w:abstractNumId="2" w15:restartNumberingAfterBreak="0">
+    <w:nsid w:val="48BC057A"/>
+    <w:multiLevelType w:val="multilevel"/>
+    <w:tmpl w:val="ACD055F4"/>
+    <w:lvl w:ilvl="0">
+      <w:start w:val="1"/>
+      <w:numFmt w:val="bullet"/>
+      <w:lvlText w:val=""/>
+      <w:lvlJc w:val="left"/>
+      <w:pPr>
+        <w:tabs>
+          <w:tab w:val="num" w:pos="720"/>
+        </w:tabs>
+        <w:ind w:left="720" w:hanging="360"/>
+      </w:pPr>
+      <w:rPr>
+        <w:rFonts w:ascii="Symbol" w:hAnsi="Symbol" w:hint="default"/>
+        <w:sz w:val="20"/>
+      </w:rPr>
+    </w:lvl>
+    <w:lvl w:ilvl="1" w:tentative="1">
+      <w:start w:val="1"/>
+      <w:numFmt w:val="bullet"/>
+      <w:lvlText w:val="o"/>
+      <w:lvlJc w:val="left"/>
+      <w:pPr>
+        <w:tabs>
+          <w:tab w:val="num" w:pos="1440"/>
+        </w:tabs>
+        <w:ind w:left="1440" w:hanging="360"/>
+      </w:pPr>
+      <w:rPr>
+        <w:rFonts w:ascii="Courier New" w:hAnsi="Courier New" w:hint="default"/>
+        <w:sz w:val="20"/>
+      </w:rPr>
+    </w:lvl>
+    <w:lvl w:ilvl="2" w:tentative="1">
+      <w:start w:val="1"/>
+      <w:numFmt w:val="bullet"/>
+      <w:lvlText w:val=""/>
+      <w:lvlJc w:val="left"/>
+      <w:pPr>
+        <w:tabs>
+          <w:tab w:val="num" w:pos="2160"/>
+        </w:tabs>
+        <w:ind w:left="2160" w:hanging="360"/>
+      </w:pPr>
+      <w:rPr>
+        <w:rFonts w:ascii="Wingdings" w:hAnsi="Wingdings" w:hint="default"/>
+        <w:sz w:val="20"/>
+      </w:rPr>
+    </w:lvl>
+    <w:lvl w:ilvl="3" w:tentative="1">
+      <w:start w:val="1"/>
+      <w:numFmt w:val="bullet"/>
+      <w:lvlText w:val=""/>
+      <w:lvlJc w:val="left"/>
+      <w:pPr>
+        <w:tabs>
+          <w:tab w:val="num" w:pos="2880"/>
+        </w:tabs>
+        <w:ind w:left="2880" w:hanging="360"/>
+      </w:pPr>
+      <w:rPr>
+        <w:rFonts w:ascii="Wingdings" w:hAnsi="Wingdings" w:hint="default"/>
+        <w:sz w:val="20"/>
+      </w:rPr>
+    </w:lvl>
+    <w:lvl w:ilvl="4" w:tentative="1">
+      <w:start w:val="1"/>
+      <w:numFmt w:val="bullet"/>
+      <w:lvlText w:val=""/>
+      <w:lvlJc w:val="left"/>
+      <w:pPr>
+        <w:tabs>
+          <w:tab w:val="num" w:pos="3600"/>
+        </w:tabs>
+        <w:ind w:left="3600" w:hanging="360"/>
+      </w:pPr>
+      <w:rPr>
+        <w:rFonts w:ascii="Wingdings" w:hAnsi="Wingdings" w:hint="default"/>
+        <w:sz w:val="20"/>
+      </w:rPr>
+    </w:lvl>
+    <w:lvl w:ilvl="5" w:tentative="1">
+      <w:start w:val="1"/>
+      <w:numFmt w:val="bullet"/>
+      <w:lvlText w:val=""/>
+      <w:lvlJc w:val="left"/>
+      <w:pPr>
+        <w:tabs>
+          <w:tab w:val="num" w:pos="4320"/>
+        </w:tabs>
+        <w:ind w:left="4320" w:hanging="360"/>
+      </w:pPr>
+      <w:rPr>
+        <w:rFonts w:ascii="Wingdings" w:hAnsi="Wingdings" w:hint="default"/>
+        <w:sz w:val="20"/>
+      </w:rPr>
+    </w:lvl>
+    <w:lvl w:ilvl="6" w:tentative="1">
+      <w:start w:val="1"/>
+      <w:numFmt w:val="bullet"/>
+      <w:lvlText w:val=""/>
+      <w:lvlJc w:val="left"/>
+      <w:pPr>
+        <w:tabs>
+          <w:tab w:val="num" w:pos="5040"/>
+        </w:tabs>
+        <w:ind w:left="5040" w:hanging="360"/>
+      </w:pPr>
+      <w:rPr>
+        <w:rFonts w:ascii="Wingdings" w:hAnsi="Wingdings" w:hint="default"/>
+        <w:sz w:val="20"/>
+      </w:rPr>
+    </w:lvl>
+    <w:lvl w:ilvl="7" w:tentative="1">
+      <w:start w:val="1"/>
+      <w:numFmt w:val="bullet"/>
+      <w:lvlText w:val=""/>
+      <w:lvlJc w:val="left"/>
+      <w:pPr>
+        <w:tabs>
+          <w:tab w:val="num" w:pos="5760"/>
+        </w:tabs>
+        <w:ind w:left="5760" w:hanging="360"/>
+      </w:pPr>
+      <w:rPr>
+        <w:rFonts w:ascii="Wingdings" w:hAnsi="Wingdings" w:hint="default"/>
+        <w:sz w:val="20"/>
+      </w:rPr>
+    </w:lvl>
+    <w:lvl w:ilvl="8" w:tentative="1">
+      <w:start w:val="1"/>
+      <w:numFmt w:val="bullet"/>
+      <w:lvlText w:val=""/>
+      <w:lvlJc w:val="left"/>
+      <w:pPr>
+        <w:tabs>
+          <w:tab w:val="num" w:pos="6480"/>
+        </w:tabs>
+        <w:ind w:left="6480" w:hanging="360"/>
+      </w:pPr>
+      <w:rPr>
+        <w:rFonts w:ascii="Wingdings" w:hAnsi="Wingdings" w:hint="default"/>
+        <w:sz w:val="20"/>
+      </w:rPr>
+    </w:lvl>
+  </w:abstractNum>
+  <w:abstractNum w:abstractNumId="3" w15:restartNumberingAfterBreak="0">
+    <w:nsid w:val="51C54314"/>
+    <w:multiLevelType w:val="multilevel"/>
+    <w:tmpl w:val="3D2E8554"/>
+    <w:lvl w:ilvl="0">
+      <w:start w:val="1"/>
+      <w:numFmt w:val="bullet"/>
+      <w:lvlText w:val=""/>
+      <w:lvlJc w:val="left"/>
+      <w:pPr>
+        <w:tabs>
+          <w:tab w:val="num" w:pos="720"/>
+        </w:tabs>
+        <w:ind w:left="720" w:hanging="360"/>
+      </w:pPr>
+      <w:rPr>
+        <w:rFonts w:ascii="Symbol" w:hAnsi="Symbol" w:hint="default"/>
+        <w:sz w:val="20"/>
+      </w:rPr>
+    </w:lvl>
+    <w:lvl w:ilvl="1" w:tentative="1">
+      <w:start w:val="1"/>
+      <w:numFmt w:val="bullet"/>
+      <w:lvlText w:val="o"/>
+      <w:lvlJc w:val="left"/>
+      <w:pPr>
+        <w:tabs>
+          <w:tab w:val="num" w:pos="1440"/>
+        </w:tabs>
+        <w:ind w:left="1440" w:hanging="360"/>
+      </w:pPr>
+      <w:rPr>
+        <w:rFonts w:ascii="Courier New" w:hAnsi="Courier New" w:hint="default"/>
+        <w:sz w:val="20"/>
+      </w:rPr>
+    </w:lvl>
+    <w:lvl w:ilvl="2" w:tentative="1">
+      <w:start w:val="1"/>
+      <w:numFmt w:val="bullet"/>
+      <w:lvlText w:val=""/>
+      <w:lvlJc w:val="left"/>
+      <w:pPr>
+        <w:tabs>
+          <w:tab w:val="num" w:pos="2160"/>
+        </w:tabs>
+        <w:ind w:left="2160" w:hanging="360"/>
+      </w:pPr>
+      <w:rPr>
+        <w:rFonts w:ascii="Wingdings" w:hAnsi="Wingdings" w:hint="default"/>
+        <w:sz w:val="20"/>
+      </w:rPr>
+    </w:lvl>
+    <w:lvl w:ilvl="3" w:tentative="1">
+      <w:start w:val="1"/>
+      <w:numFmt w:val="bullet"/>
+      <w:lvlText w:val=""/>
+      <w:lvlJc w:val="left"/>
+      <w:pPr>
+        <w:tabs>
+          <w:tab w:val="num" w:pos="2880"/>
+        </w:tabs>
+        <w:ind w:left="2880" w:hanging="360"/>
+      </w:pPr>
+      <w:rPr>
+        <w:rFonts w:ascii="Wingdings" w:hAnsi="Wingdings" w:hint="default"/>
+        <w:sz w:val="20"/>
+      </w:rPr>
+    </w:lvl>
+    <w:lvl w:ilvl="4" w:tentative="1">
+      <w:start w:val="1"/>
+      <w:numFmt w:val="bullet"/>
+      <w:lvlText w:val=""/>
+      <w:lvlJc w:val="left"/>
+      <w:pPr>
+        <w:tabs>
+          <w:tab w:val="num" w:pos="3600"/>
+        </w:tabs>
+        <w:ind w:left="3600" w:hanging="360"/>
+      </w:pPr>
+      <w:rPr>
+        <w:rFonts w:ascii="Wingdings" w:hAnsi="Wingdings" w:hint="default"/>
+        <w:sz w:val="20"/>
+      </w:rPr>
+    </w:lvl>
+    <w:lvl w:ilvl="5" w:tentative="1">
+      <w:start w:val="1"/>
+      <w:numFmt w:val="bullet"/>
+      <w:lvlText w:val=""/>
+      <w:lvlJc w:val="left"/>
+      <w:pPr>
+        <w:tabs>
+          <w:tab w:val="num" w:pos="4320"/>
+        </w:tabs>
+        <w:ind w:left="4320" w:hanging="360"/>
+      </w:pPr>
+      <w:rPr>
+        <w:rFonts w:ascii="Wingdings" w:hAnsi="Wingdings" w:hint="default"/>
+        <w:sz w:val="20"/>
+      </w:rPr>
+    </w:lvl>
+    <w:lvl w:ilvl="6" w:tentative="1">
+      <w:start w:val="1"/>
+      <w:numFmt w:val="bullet"/>
+      <w:lvlText w:val=""/>
+      <w:lvlJc w:val="left"/>
+      <w:pPr>
+        <w:tabs>
+          <w:tab w:val="num" w:pos="5040"/>
+        </w:tabs>
+        <w:ind w:left="5040" w:hanging="360"/>
+      </w:pPr>
+      <w:rPr>
+        <w:rFonts w:ascii="Wingdings" w:hAnsi="Wingdings" w:hint="default"/>
+        <w:sz w:val="20"/>
+      </w:rPr>
+    </w:lvl>
+    <w:lvl w:ilvl="7" w:tentative="1">
+      <w:start w:val="1"/>
+      <w:numFmt w:val="bullet"/>
+      <w:lvlText w:val=""/>
+      <w:lvlJc w:val="left"/>
+      <w:pPr>
+        <w:tabs>
+          <w:tab w:val="num" w:pos="5760"/>
+        </w:tabs>
+        <w:ind w:left="5760" w:hanging="360"/>
+      </w:pPr>
+      <w:rPr>
+        <w:rFonts w:ascii="Wingdings" w:hAnsi="Wingdings" w:hint="default"/>
+        <w:sz w:val="20"/>
+      </w:rPr>
+    </w:lvl>
+    <w:lvl w:ilvl="8" w:tentative="1">
+      <w:start w:val="1"/>
+      <w:numFmt w:val="bullet"/>
+      <w:lvlText w:val=""/>
+      <w:lvlJc w:val="left"/>
+      <w:pPr>
+        <w:tabs>
+          <w:tab w:val="num" w:pos="6480"/>
+        </w:tabs>
+        <w:ind w:left="6480" w:hanging="360"/>
+      </w:pPr>
+      <w:rPr>
+        <w:rFonts w:ascii="Wingdings" w:hAnsi="Wingdings" w:hint="default"/>
+        <w:sz w:val="20"/>
+      </w:rPr>
+    </w:lvl>
+  </w:abstractNum>
+  <w:abstractNum w:abstractNumId="4" w15:restartNumberingAfterBreak="0">
+    <w:nsid w:val="6159570D"/>
+    <w:multiLevelType w:val="multilevel"/>
+    <w:tmpl w:val="B5F4DF56"/>
+    <w:lvl w:ilvl="0">
+      <w:start w:val="1"/>
+      <w:numFmt w:val="bullet"/>
+      <w:lvlText w:val=""/>
+      <w:lvlJc w:val="left"/>
+      <w:pPr>
+        <w:tabs>
+          <w:tab w:val="num" w:pos="720"/>
+        </w:tabs>
+        <w:ind w:left="720" w:hanging="360"/>
+      </w:pPr>
+      <w:rPr>
+        <w:rFonts w:ascii="Symbol" w:hAnsi="Symbol" w:hint="default"/>
+        <w:sz w:val="20"/>
+      </w:rPr>
+    </w:lvl>
+    <w:lvl w:ilvl="1" w:tentative="1">
+      <w:start w:val="1"/>
+      <w:numFmt w:val="bullet"/>
+      <w:lvlText w:val="o"/>
+      <w:lvlJc w:val="left"/>
+      <w:pPr>
+        <w:tabs>
+          <w:tab w:val="num" w:pos="1440"/>
+        </w:tabs>
+        <w:ind w:left="1440" w:hanging="360"/>
+      </w:pPr>
+      <w:rPr>
+        <w:rFonts w:ascii="Courier New" w:hAnsi="Courier New" w:hint="default"/>
+        <w:sz w:val="20"/>
+      </w:rPr>
+    </w:lvl>
+    <w:lvl w:ilvl="2" w:tentative="1">
+      <w:start w:val="1"/>
+      <w:numFmt w:val="bullet"/>
+      <w:lvlText w:val=""/>
+      <w:lvlJc w:val="left"/>
+      <w:pPr>
+        <w:tabs>
+          <w:tab w:val="num" w:pos="2160"/>
+        </w:tabs>
+        <w:ind w:left="2160" w:hanging="360"/>
+      </w:pPr>
+      <w:rPr>
+        <w:rFonts w:ascii="Wingdings" w:hAnsi="Wingdings" w:hint="default"/>
+        <w:sz w:val="20"/>
+      </w:rPr>
+    </w:lvl>
+    <w:lvl w:ilvl="3" w:tentative="1">
+      <w:start w:val="1"/>
+      <w:numFmt w:val="bullet"/>
+      <w:lvlText w:val=""/>
+      <w:lvlJc w:val="left"/>
+      <w:pPr>
+        <w:tabs>
+          <w:tab w:val="num" w:pos="2880"/>
+        </w:tabs>
+        <w:ind w:left="2880" w:hanging="360"/>
+      </w:pPr>
+      <w:rPr>
+        <w:rFonts w:ascii="Wingdings" w:hAnsi="Wingdings" w:hint="default"/>
+        <w:sz w:val="20"/>
+      </w:rPr>
+    </w:lvl>
+    <w:lvl w:ilvl="4" w:tentative="1">
+      <w:start w:val="1"/>
+      <w:numFmt w:val="bullet"/>
+      <w:lvlText w:val=""/>
+      <w:lvlJc w:val="left"/>
+      <w:pPr>
+        <w:tabs>
+          <w:tab w:val="num" w:pos="3600"/>
+        </w:tabs>
+        <w:ind w:left="3600" w:hanging="360"/>
+      </w:pPr>
+      <w:rPr>
+        <w:rFonts w:ascii="Wingdings" w:hAnsi="Wingdings" w:hint="default"/>
+        <w:sz w:val="20"/>
+      </w:rPr>
+    </w:lvl>
+    <w:lvl w:ilvl="5" w:tentative="1">
+      <w:start w:val="1"/>
+      <w:numFmt w:val="bullet"/>
+      <w:lvlText w:val=""/>
+      <w:lvlJc w:val="left"/>
+      <w:pPr>
+        <w:tabs>
+          <w:tab w:val="num" w:pos="4320"/>
+        </w:tabs>
+        <w:ind w:left="4320" w:hanging="360"/>
+      </w:pPr>
+      <w:rPr>
+        <w:rFonts w:ascii="Wingdings" w:hAnsi="Wingdings" w:hint="default"/>
+        <w:sz w:val="20"/>
+      </w:rPr>
+    </w:lvl>
+    <w:lvl w:ilvl="6" w:tentative="1">
+      <w:start w:val="1"/>
+      <w:numFmt w:val="bullet"/>
+      <w:lvlText w:val=""/>
+      <w:lvlJc w:val="left"/>
+      <w:pPr>
+        <w:tabs>
+          <w:tab w:val="num" w:pos="5040"/>
+        </w:tabs>
+        <w:ind w:left="5040" w:hanging="360"/>
+      </w:pPr>
+      <w:rPr>
+        <w:rFonts w:ascii="Wingdings" w:hAnsi="Wingdings" w:hint="default"/>
+        <w:sz w:val="20"/>
+      </w:rPr>
+    </w:lvl>
+    <w:lvl w:ilvl="7" w:tentative="1">
+      <w:start w:val="1"/>
+      <w:numFmt w:val="bullet"/>
+      <w:lvlText w:val=""/>
+      <w:lvlJc w:val="left"/>
+      <w:pPr>
+        <w:tabs>
+          <w:tab w:val="num" w:pos="5760"/>
+        </w:tabs>
+        <w:ind w:left="5760" w:hanging="360"/>
+      </w:pPr>
+      <w:rPr>
+        <w:rFonts w:ascii="Wingdings" w:hAnsi="Wingdings" w:hint="default"/>
+        <w:sz w:val="20"/>
+      </w:rPr>
+    </w:lvl>
+    <w:lvl w:ilvl="8" w:tentative="1">
+      <w:start w:val="1"/>
+      <w:numFmt w:val="bullet"/>
+      <w:lvlText w:val=""/>
+      <w:lvlJc w:val="left"/>
+      <w:pPr>
+        <w:tabs>
+          <w:tab w:val="num" w:pos="6480"/>
+        </w:tabs>
+        <w:ind w:left="6480" w:hanging="360"/>
+      </w:pPr>
+      <w:rPr>
+        <w:rFonts w:ascii="Wingdings" w:hAnsi="Wingdings" w:hint="default"/>
+        <w:sz w:val="20"/>
+      </w:rPr>
+    </w:lvl>
+  </w:abstractNum>
+  <w:abstractNum w:abstractNumId="5" w15:restartNumberingAfterBreak="0">
+    <w:nsid w:val="74D25AFB"/>
+    <w:multiLevelType w:val="multilevel"/>
+    <w:tmpl w:val="1E82BB18"/>
+    <w:lvl w:ilvl="0">
+      <w:start w:val="1"/>
+      <w:numFmt w:val="bullet"/>
+      <w:lvlText w:val=""/>
+      <w:lvlJc w:val="left"/>
+      <w:pPr>
+        <w:tabs>
+          <w:tab w:val="num" w:pos="720"/>
+        </w:tabs>
+        <w:ind w:left="720" w:hanging="360"/>
+      </w:pPr>
+      <w:rPr>
+        <w:rFonts w:ascii="Symbol" w:hAnsi="Symbol" w:hint="default"/>
+        <w:sz w:val="20"/>
+      </w:rPr>
+    </w:lvl>
+    <w:lvl w:ilvl="1" w:tentative="1">
+      <w:start w:val="1"/>
+      <w:numFmt w:val="bullet"/>
+      <w:lvlText w:val="o"/>
+      <w:lvlJc w:val="left"/>
+      <w:pPr>
+        <w:tabs>
+          <w:tab w:val="num" w:pos="1440"/>
+        </w:tabs>
+        <w:ind w:left="1440" w:hanging="360"/>
+      </w:pPr>
+      <w:rPr>
+        <w:rFonts w:ascii="Courier New" w:hAnsi="Courier New" w:hint="default"/>
+        <w:sz w:val="20"/>
+      </w:rPr>
+    </w:lvl>
+    <w:lvl w:ilvl="2" w:tentative="1">
+      <w:start w:val="1"/>
+      <w:numFmt w:val="bullet"/>
+      <w:lvlText w:val=""/>
+      <w:lvlJc w:val="left"/>
+      <w:pPr>
+        <w:tabs>
+          <w:tab w:val="num" w:pos="2160"/>
+        </w:tabs>
+        <w:ind w:left="2160" w:hanging="360"/>
+      </w:pPr>
+      <w:rPr>
+        <w:rFonts w:ascii="Wingdings" w:hAnsi="Wingdings" w:hint="default"/>
+        <w:sz w:val="20"/>
+      </w:rPr>
+    </w:lvl>
+    <w:lvl w:ilvl="3" w:tentative="1">
+      <w:start w:val="1"/>
+      <w:numFmt w:val="bullet"/>
+      <w:lvlText w:val=""/>
+      <w:lvlJc w:val="left"/>
+      <w:pPr>
+        <w:tabs>
+          <w:tab w:val="num" w:pos="2880"/>
+        </w:tabs>
+        <w:ind w:left="2880" w:hanging="360"/>
+      </w:pPr>
+      <w:rPr>
+        <w:rFonts w:ascii="Wingdings" w:hAnsi="Wingdings" w:hint="default"/>
+        <w:sz w:val="20"/>
+      </w:rPr>
+    </w:lvl>
+    <w:lvl w:ilvl="4" w:tentative="1">
+      <w:start w:val="1"/>
+      <w:numFmt w:val="bullet"/>
+      <w:lvlText w:val=""/>
+      <w:lvlJc w:val="left"/>
+      <w:pPr>
+        <w:tabs>
+          <w:tab w:val="num" w:pos="3600"/>
+        </w:tabs>
+        <w:ind w:left="3600" w:hanging="360"/>
+      </w:pPr>
+      <w:rPr>
+        <w:rFonts w:ascii="Wingdings" w:hAnsi="Wingdings" w:hint="default"/>
+        <w:sz w:val="20"/>
+      </w:rPr>
+    </w:lvl>
+    <w:lvl w:ilvl="5" w:tentative="1">
+      <w:start w:val="1"/>
+      <w:numFmt w:val="bullet"/>
+      <w:lvlText w:val=""/>
+      <w:lvlJc w:val="left"/>
+      <w:pPr>
+        <w:tabs>
+          <w:tab w:val="num" w:pos="4320"/>
+        </w:tabs>
+        <w:ind w:left="4320" w:hanging="360"/>
+      </w:pPr>
+      <w:rPr>
+        <w:rFonts w:ascii="Wingdings" w:hAnsi="Wingdings" w:hint="default"/>
+        <w:sz w:val="20"/>
+      </w:rPr>
+    </w:lvl>
+    <w:lvl w:ilvl="6" w:tentative="1">
+      <w:start w:val="1"/>
+      <w:numFmt w:val="bullet"/>
+      <w:lvlText w:val=""/>
+      <w:lvlJc w:val="left"/>
+      <w:pPr>
+        <w:tabs>
+          <w:tab w:val="num" w:pos="5040"/>
+        </w:tabs>
+        <w:ind w:left="5040" w:hanging="360"/>
+      </w:pPr>
+      <w:rPr>
+        <w:rFonts w:ascii="Wingdings" w:hAnsi="Wingdings" w:hint="default"/>
+        <w:sz w:val="20"/>
+      </w:rPr>
+    </w:lvl>
+    <w:lvl w:ilvl="7" w:tentative="1">
+      <w:start w:val="1"/>
+      <w:numFmt w:val="bullet"/>
+      <w:lvlText w:val=""/>
+      <w:lvlJc w:val="left"/>
+      <w:pPr>
+        <w:tabs>
+          <w:tab w:val="num" w:pos="5760"/>
+        </w:tabs>
+        <w:ind w:left="5760" w:hanging="360"/>
+      </w:pPr>
+      <w:rPr>
+        <w:rFonts w:ascii="Wingdings" w:hAnsi="Wingdings" w:hint="default"/>
+        <w:sz w:val="20"/>
+      </w:rPr>
+    </w:lvl>
+    <w:lvl w:ilvl="8" w:tentative="1">
+      <w:start w:val="1"/>
+      <w:numFmt w:val="bullet"/>
+      <w:lvlText w:val=""/>
+      <w:lvlJc w:val="left"/>
+      <w:pPr>
+        <w:tabs>
+          <w:tab w:val="num" w:pos="6480"/>
+        </w:tabs>
+        <w:ind w:left="6480" w:hanging="360"/>
+      </w:pPr>
+      <w:rPr>
+        <w:rFonts w:ascii="Wingdings" w:hAnsi="Wingdings" w:hint="default"/>
+        <w:sz w:val="20"/>
+      </w:rPr>
+    </w:lvl>
+  </w:abstractNum>
   <w:num w:numId="1" w16cid:durableId="717095563">
+    <w:abstractNumId w:val="3"/>
+  </w:num>
+  <w:num w:numId="2" w16cid:durableId="1409690427">
     <w:abstractNumId w:val="1"/>
   </w:num>
-  <w:num w:numId="2" w16cid:durableId="1409690427">
+  <w:num w:numId="3" w16cid:durableId="442697641">
+    <w:abstractNumId w:val="5"/>
+  </w:num>
+  <w:num w:numId="4" w16cid:durableId="1397708629">
     <w:abstractNumId w:val="0"/>
+  </w:num>
+  <w:num w:numId="5" w16cid:durableId="1139034969">
+    <w:abstractNumId w:val="4"/>
+  </w:num>
+  <w:num w:numId="6" w16cid:durableId="22021418">
+    <w:abstractNumId w:val="2"/>
   </w:num>
 </w:numbering>
 </file>

</xml_diff>